<commit_message>
Enhance functionality and improve performance
</commit_message>
<xml_diff>
--- a/AAP10-Git.docx
+++ b/AAP10-Git.docx
@@ -47,16 +47,8 @@
               <w:rPr>
                 <w:sz w:val="44"/>
               </w:rPr>
-              <w:t xml:space="preserve">AAP10: Arbeiten mit </w:t>
+              <w:t>AAP10: Arbeiten mit git</w:t>
             </w:r>
-            <w:proofErr w:type="spellStart"/>
-            <w:r>
-              <w:rPr>
-                <w:sz w:val="44"/>
-              </w:rPr>
-              <w:t>git</w:t>
-            </w:r>
-            <w:proofErr w:type="spellEnd"/>
             <w:r>
               <w:rPr>
                 <w:sz w:val="44"/>
@@ -175,7 +167,6 @@
             <w:r>
               <w:t xml:space="preserve">Hilfe:  Unterricht mit </w:t>
             </w:r>
-            <w:proofErr w:type="spellStart"/>
             <w:r>
               <w:rPr>
                 <w:rFonts w:ascii="Consolas" w:hAnsi="Consolas" w:cs="Consolas"/>
@@ -186,46 +177,7 @@
                 <w:szCs w:val="24"/>
                 <w:lang w:eastAsia="de-DE"/>
               </w:rPr>
-              <w:t>Powerpointfolien</w:t>
-            </w:r>
-            <w:proofErr w:type="spellEnd"/>
-            <w:r>
-              <w:rPr>
-                <w:rFonts w:ascii="Consolas" w:hAnsi="Consolas" w:cs="Consolas"/>
-                <w:i/>
-                <w:iCs/>
-                <w:color w:val="00AA00"/>
-                <w:sz w:val="24"/>
-                <w:szCs w:val="24"/>
-                <w:lang w:eastAsia="de-DE"/>
-              </w:rPr>
-              <w:t xml:space="preserve">, Skriptum Prof. </w:t>
-            </w:r>
-            <w:proofErr w:type="spellStart"/>
-            <w:r>
-              <w:rPr>
-                <w:rFonts w:ascii="Consolas" w:hAnsi="Consolas" w:cs="Consolas"/>
-                <w:i/>
-                <w:iCs/>
-                <w:color w:val="00AA00"/>
-                <w:sz w:val="24"/>
-                <w:szCs w:val="24"/>
-                <w:lang w:eastAsia="de-DE"/>
-              </w:rPr>
-              <w:t>Signitzer</w:t>
-            </w:r>
-            <w:proofErr w:type="spellEnd"/>
-            <w:r>
-              <w:rPr>
-                <w:rFonts w:ascii="Consolas" w:hAnsi="Consolas" w:cs="Consolas"/>
-                <w:i/>
-                <w:iCs/>
-                <w:color w:val="00AA00"/>
-                <w:sz w:val="24"/>
-                <w:szCs w:val="24"/>
-                <w:lang w:eastAsia="de-DE"/>
-              </w:rPr>
-              <w:t xml:space="preserve">, </w:t>
+              <w:t xml:space="preserve">Powerpointfolien, Skriptum Prof. Signitzer, </w:t>
             </w:r>
             <w:r>
               <w:t>Internet</w:t>
@@ -374,23 +326,7 @@
               <w:t>VSC</w:t>
             </w:r>
             <w:r>
-              <w:t xml:space="preserve"> und klont mit den integrierten </w:t>
-            </w:r>
-            <w:proofErr w:type="gramStart"/>
-            <w:r>
-              <w:t>GIT Tools</w:t>
-            </w:r>
-            <w:proofErr w:type="gramEnd"/>
-            <w:r>
-              <w:t xml:space="preserve"> ein </w:t>
-            </w:r>
-            <w:proofErr w:type="gramStart"/>
-            <w:r>
-              <w:t>Test Projekt</w:t>
-            </w:r>
-            <w:proofErr w:type="gramEnd"/>
-            <w:r>
-              <w:t xml:space="preserve"> von GitHub</w:t>
+              <w:t xml:space="preserve"> und klont mit den integrierten GIT Tools ein Test Projekt von GitHub</w:t>
             </w:r>
           </w:p>
           <w:p>
@@ -411,34 +347,11 @@
             </w:r>
             <w:r>
               <w:br w:type="textWrapping" w:clear="all"/>
-            </w:r>
-            <w:proofErr w:type="gramStart"/>
-            <w:r>
-              <w:t>Lasst</w:t>
-            </w:r>
-            <w:proofErr w:type="gramEnd"/>
-            <w:r>
-              <w:t xml:space="preserve"> das Programm laufen, schaut Euch die </w:t>
-            </w:r>
-            <w:proofErr w:type="spellStart"/>
-            <w:r>
-              <w:t>Git</w:t>
-            </w:r>
-            <w:proofErr w:type="spellEnd"/>
-            <w:r>
-              <w:t>-Historie an.</w:t>
+              <w:t>Lasst das Programm laufen, schaut Euch die Git-Historie an.</w:t>
             </w:r>
             <w:r>
               <w:br w:type="textWrapping" w:clear="all"/>
-              <w:t xml:space="preserve">Macht und </w:t>
-            </w:r>
-            <w:proofErr w:type="spellStart"/>
-            <w:r>
-              <w:t>commitet</w:t>
-            </w:r>
-            <w:proofErr w:type="spellEnd"/>
-            <w:r>
-              <w:t xml:space="preserve"> Änderungen in Eurem lokalen Repository.</w:t>
+              <w:t>Macht und commitet Änderungen in Eurem lokalen Repository.</w:t>
             </w:r>
             <w:r>
               <w:br w:type="textWrapping" w:clear="all"/>
@@ -460,23 +373,7 @@
             </w:r>
             <w:r>
               <w:br w:type="textWrapping" w:clear="all"/>
-              <w:t xml:space="preserve">(dokumentiert hier Eure Benutzerkennung sowie die URL Eures </w:t>
-            </w:r>
-            <w:proofErr w:type="spellStart"/>
-            <w:r>
-              <w:t>Repositories</w:t>
-            </w:r>
-            <w:proofErr w:type="spellEnd"/>
-            <w:r>
-              <w:t xml:space="preserve"> bei GitHub und macht einen </w:t>
-            </w:r>
-            <w:proofErr w:type="spellStart"/>
-            <w:r>
-              <w:t>screenshot</w:t>
-            </w:r>
-            <w:proofErr w:type="spellEnd"/>
-            <w:r>
-              <w:t xml:space="preserve"> Eurer GitHub-Repository-Webseite)</w:t>
+              <w:t>(dokumentiert hier Eure Benutzerkennung sowie die URL Eures Repositories bei GitHub und macht einen screenshot Eurer GitHub-Repository-Webseite)</w:t>
             </w:r>
             <w:r>
               <w:br w:type="textWrapping" w:clear="all"/>
@@ -505,7 +402,7 @@
                   <v:path o:extrusionok="f" gradientshapeok="t" o:connecttype="rect"/>
                   <o:lock v:ext="edit" aspectratio="t"/>
                 </v:shapetype>
-                <v:shape id="Grafik 1" o:spid="_x0000_i1025" type="#_x0000_t75" style="width:406.3pt;height:205.7pt;visibility:visible;mso-wrap-style:square">
+                <v:shape id="Grafik 1" o:spid="_x0000_i1025" type="#_x0000_t75" style="width:405.8pt;height:204.45pt;visibility:visible;mso-wrap-style:square">
                   <v:imagedata r:id="rId12" o:title=""/>
                 </v:shape>
               </w:pict>
@@ -520,15 +417,7 @@
               <w:spacing w:after="0" w:line="240" w:lineRule="auto"/>
             </w:pPr>
             <w:r>
-              <w:t xml:space="preserve">Erzeugt mit </w:t>
-            </w:r>
-            <w:proofErr w:type="spellStart"/>
-            <w:r>
-              <w:t>git</w:t>
-            </w:r>
-            <w:proofErr w:type="spellEnd"/>
-            <w:r>
-              <w:t xml:space="preserve"> clone eine Kopie Eures neuen GitHub Repos in eurer </w:t>
+              <w:t xml:space="preserve">Erzeugt mit git clone eine Kopie Eures neuen GitHub Repos in eurer </w:t>
             </w:r>
             <w:r>
               <w:rPr>
@@ -544,65 +433,25 @@
             </w:r>
             <w:r>
               <w:br w:type="textWrapping" w:clear="all"/>
+              <w:t>Erstellt in der Umgebung im Projekt weitere Dateien wie z.B. ein personalisiertes HelloWorld.py .</w:t>
             </w:r>
-            <w:proofErr w:type="gramStart"/>
-            <w:r>
-              <w:t>Erstellt</w:t>
-            </w:r>
-            <w:proofErr w:type="gramEnd"/>
-            <w:r>
-              <w:t xml:space="preserve"> in der Umgebung im Projekt weitere Dateien wie z.B. ein personalisiertes </w:t>
-            </w:r>
-            <w:proofErr w:type="gramStart"/>
-            <w:r>
-              <w:t>HelloWorld.py .</w:t>
-            </w:r>
-            <w:proofErr w:type="gramEnd"/>
             <w:r>
               <w:br w:type="textWrapping" w:clear="all"/>
-            </w:r>
-            <w:proofErr w:type="spellStart"/>
-            <w:r>
-              <w:t>Commitet</w:t>
-            </w:r>
-            <w:proofErr w:type="spellEnd"/>
-            <w:r>
-              <w:t xml:space="preserve"> Eure Änderungen in Euer lokales Repo.</w:t>
+              <w:t>Commitet Eure Änderungen in Euer lokales Repo.</w:t>
             </w:r>
             <w:r>
               <w:br w:type="textWrapping" w:clear="all"/>
             </w:r>
             <w:r>
               <w:br w:type="textWrapping" w:clear="all"/>
-              <w:t>Vorsicht: Beachtet dabei Eure Privatsphäre (</w:t>
-            </w:r>
-            <w:proofErr w:type="spellStart"/>
-            <w:proofErr w:type="gramStart"/>
-            <w:r>
-              <w:t>privacy</w:t>
-            </w:r>
-            <w:proofErr w:type="spellEnd"/>
-            <w:r>
-              <w:t>)  -</w:t>
-            </w:r>
-            <w:proofErr w:type="gramEnd"/>
-            <w:r>
-              <w:t xml:space="preserve"> ihr werdet das Projekt ja bei GitHub veröffentlichen.</w:t>
+              <w:t>Vorsicht: Beachtet dabei Eure Privatsphäre (privacy)  - ihr werdet das Projekt ja bei GitHub veröffentlichen.</w:t>
             </w:r>
             <w:r>
               <w:br w:type="textWrapping" w:clear="all"/>
             </w:r>
             <w:r>
               <w:br w:type="textWrapping" w:clear="all"/>
-              <w:t>(</w:t>
-            </w:r>
-            <w:proofErr w:type="spellStart"/>
-            <w:r>
-              <w:t>screenshot</w:t>
-            </w:r>
-            <w:proofErr w:type="spellEnd"/>
-            <w:r>
-              <w:t xml:space="preserve"> der </w:t>
+              <w:t xml:space="preserve">(screenshot der </w:t>
             </w:r>
             <w:r>
               <w:rPr>
@@ -631,7 +480,7 @@
               </w:rPr>
               <w:lastRenderedPageBreak/>
               <w:pict w14:anchorId="5C3C8BC7">
-                <v:shape id="_x0000_i1029" type="#_x0000_t75" style="width:303.45pt;height:174.85pt;visibility:visible;mso-wrap-style:square">
+                <v:shape id="_x0000_i1029" type="#_x0000_t75" style="width:305.7pt;height:172.9pt;visibility:visible;mso-wrap-style:square">
                   <v:imagedata r:id="rId13" o:title=""/>
                 </v:shape>
               </w:pict>
@@ -662,22 +511,14 @@
                 <w:noProof/>
               </w:rPr>
               <w:pict w14:anchorId="1F415C92">
-                <v:shape id="_x0000_i1038" type="#_x0000_t75" style="width:385.7pt;height:118.3pt;visibility:visible;mso-wrap-style:square">
+                <v:shape id="_x0000_i1038" type="#_x0000_t75" style="width:385.8pt;height:118.2pt;visibility:visible;mso-wrap-style:square">
                   <v:imagedata r:id="rId14" o:title=""/>
                 </v:shape>
               </w:pict>
             </w:r>
             <w:r>
               <w:br w:type="textWrapping" w:clear="all"/>
-              <w:t>(</w:t>
-            </w:r>
-            <w:proofErr w:type="spellStart"/>
-            <w:r>
-              <w:t>screenshots</w:t>
-            </w:r>
-            <w:proofErr w:type="spellEnd"/>
-            <w:r>
-              <w:t xml:space="preserve"> der Webansicht Eures Projekts bei GitHub)</w:t>
+              <w:t>(screenshots der Webansicht Eures Projekts bei GitHub)</w:t>
             </w:r>
             <w:r>
               <w:br w:type="textWrapping" w:clear="all"/>
@@ -692,15 +533,7 @@
               <w:spacing w:after="0" w:line="240" w:lineRule="auto"/>
             </w:pPr>
             <w:r>
-              <w:t xml:space="preserve">Findet einen Partner in der Klasse und berechtigt Euch wechselseitig für Eure </w:t>
-            </w:r>
-            <w:proofErr w:type="spellStart"/>
-            <w:r>
-              <w:t>Git</w:t>
-            </w:r>
-            <w:proofErr w:type="spellEnd"/>
-            <w:r>
-              <w:t>-Hub-Projekte.</w:t>
+              <w:t>Findet einen Partner in der Klasse und berechtigt Euch wechselseitig für Eure Git-Hub-Projekte.</w:t>
             </w:r>
             <w:r>
               <w:br w:type="textWrapping" w:clear="all"/>
@@ -710,22 +543,14 @@
                 <w:noProof/>
               </w:rPr>
               <w:pict w14:anchorId="085491F2">
-                <v:shape id="_x0000_i1044" type="#_x0000_t75" style="width:380.55pt;height:118.3pt;visibility:visible;mso-wrap-style:square">
+                <v:shape id="_x0000_i1044" type="#_x0000_t75" style="width:381.2pt;height:120.5pt;visibility:visible;mso-wrap-style:square">
                   <v:imagedata r:id="rId15" o:title=""/>
                 </v:shape>
               </w:pict>
             </w:r>
             <w:r>
               <w:br w:type="textWrapping" w:clear="all"/>
-              <w:t>(</w:t>
-            </w:r>
-            <w:proofErr w:type="spellStart"/>
-            <w:r>
-              <w:t>screenshot</w:t>
-            </w:r>
-            <w:proofErr w:type="spellEnd"/>
-            <w:r>
-              <w:t xml:space="preserve"> Rechtevergabe)</w:t>
+              <w:t>(screenshot Rechtevergabe)</w:t>
             </w:r>
             <w:r>
               <w:br w:type="textWrapping" w:clear="all"/>
@@ -749,30 +574,24 @@
               <w:t>VSC</w:t>
             </w:r>
             <w:r>
-              <w:t xml:space="preserve">-Projekt auf Eurem PC. Bringt dort zuerst lokal und dann auch im Remote-Repository bei </w:t>
-            </w:r>
-            <w:proofErr w:type="spellStart"/>
-            <w:r>
-              <w:t>GitHUB</w:t>
-            </w:r>
-            <w:proofErr w:type="spellEnd"/>
-            <w:r>
-              <w:t xml:space="preserve"> Eure Änderungen ein.</w:t>
+              <w:t>-Projekt auf Eurem PC. Bringt dort zuerst lokal und dann auch im Remote-Repository bei GitHUB Eure Änderungen ein.</w:t>
             </w:r>
             <w:r>
               <w:br w:type="textWrapping" w:clear="all"/>
             </w:r>
             <w:r>
+              <w:rPr>
+                <w:noProof/>
+              </w:rPr>
+              <w:pict w14:anchorId="3BD5EAE9">
+                <v:shape id="_x0000_i1052" type="#_x0000_t75" style="width:214.85pt;height:105.5pt;visibility:visible;mso-wrap-style:square">
+                  <v:imagedata r:id="rId16" o:title=""/>
+                </v:shape>
+              </w:pict>
+            </w:r>
+            <w:r>
               <w:br w:type="textWrapping" w:clear="all"/>
-              <w:t>(</w:t>
-            </w:r>
-            <w:proofErr w:type="spellStart"/>
-            <w:r>
-              <w:t>screenshots</w:t>
-            </w:r>
-            <w:proofErr w:type="spellEnd"/>
-            <w:r>
-              <w:t>)</w:t>
+              <w:t>(screenshots)</w:t>
             </w:r>
             <w:r>
               <w:br w:type="textWrapping" w:clear="all"/>
@@ -802,23 +621,7 @@
               <w:spacing w:after="0" w:line="240" w:lineRule="auto"/>
             </w:pPr>
             <w:r>
-              <w:t xml:space="preserve">Gebt dem User </w:t>
-            </w:r>
-            <w:proofErr w:type="spellStart"/>
-            <w:r>
-              <w:t>mue-htl</w:t>
-            </w:r>
-            <w:proofErr w:type="spellEnd"/>
-            <w:r>
-              <w:t xml:space="preserve"> einen Zugriff auf Euer </w:t>
-            </w:r>
-            <w:proofErr w:type="spellStart"/>
-            <w:r>
-              <w:t>Github</w:t>
-            </w:r>
-            <w:proofErr w:type="spellEnd"/>
-            <w:r>
-              <w:t xml:space="preserve"> Projekt.</w:t>
+              <w:t>Gebt dem User mue-htl einen Zugriff auf Euer Github Projekt.</w:t>
             </w:r>
           </w:p>
           <w:p>
@@ -855,14 +658,7 @@
             </w:r>
             <w:r>
               <w:br w:type="textWrapping" w:clear="all"/>
-            </w:r>
-            <w:proofErr w:type="gramStart"/>
-            <w:r>
-              <w:t>Gebt</w:t>
-            </w:r>
-            <w:proofErr w:type="gramEnd"/>
-            <w:r>
-              <w:t xml:space="preserve"> Euren Beitrag als AAP10-</w:t>
+              <w:t>Gebt Euren Beitrag als AAP10-</w:t>
             </w:r>
             <w:r>
               <w:rPr>
@@ -872,15 +668,7 @@
               <w:t>Name</w:t>
             </w:r>
             <w:r>
-              <w:t xml:space="preserve">.pdf im </w:t>
-            </w:r>
-            <w:proofErr w:type="spellStart"/>
-            <w:r>
-              <w:t>moodle</w:t>
-            </w:r>
-            <w:proofErr w:type="spellEnd"/>
-            <w:r>
-              <w:t xml:space="preserve"> ab!</w:t>
+              <w:t>.pdf im moodle ab!</w:t>
             </w:r>
           </w:p>
         </w:tc>

</xml_diff>